<commit_message>
feat: overhaul mass email dispatching with chunking and improve plantilla UI fields
</commit_message>
<xml_diff>
--- a/rsp-dashboard/public/templates/Notice to DQ - No Omnibus.docx
+++ b/rsp-dashboard/public/templates/Notice to DQ - No Omnibus.docx
@@ -23,7 +23,21 @@
         <w:rPr>
           <w:rFonts w:ascii="Bookman Old Style" w:hAnsi="Bookman Old Style"/>
         </w:rPr>
-        <w:t>{FormattedDate}</w:t>
+        <w:t>{</w:t>
+      </w:r>
+      <w:proofErr w:type="spellStart"/>
+      <w:r>
+        <w:rPr>
+          <w:rFonts w:ascii="Bookman Old Style" w:hAnsi="Bookman Old Style"/>
+        </w:rPr>
+        <w:t>FormattedDate</w:t>
+      </w:r>
+      <w:proofErr w:type="spellEnd"/>
+      <w:r>
+        <w:rPr>
+          <w:rFonts w:ascii="Bookman Old Style" w:hAnsi="Bookman Old Style"/>
+        </w:rPr>
+        <w:t>}</w:t>
       </w:r>
     </w:p>
     <w:p>
@@ -49,7 +63,25 @@
           <w:b/>
           <w:bCs/>
         </w:rPr>
-        <w:t>{ApplicantName}</w:t>
+        <w:t>{</w:t>
+      </w:r>
+      <w:proofErr w:type="spellStart"/>
+      <w:r>
+        <w:rPr>
+          <w:rFonts w:ascii="Bookman Old Style" w:hAnsi="Bookman Old Style"/>
+          <w:b/>
+          <w:bCs/>
+        </w:rPr>
+        <w:t>ApplicantName</w:t>
+      </w:r>
+      <w:proofErr w:type="spellEnd"/>
+      <w:r>
+        <w:rPr>
+          <w:rFonts w:ascii="Bookman Old Style" w:hAnsi="Bookman Old Style"/>
+          <w:b/>
+          <w:bCs/>
+        </w:rPr>
+        <w:t>}</w:t>
       </w:r>
     </w:p>
     <w:p>
@@ -403,6 +435,7 @@
               </w:rPr>
               <w:t>Education:</w:t>
             </w:r>
+            <w:proofErr w:type="gramStart"/>
             <w:r>
               <w:rPr>
                 <w:rFonts w:ascii="Bookman Old Style" w:hAnsi="Bookman Old Style"/>
@@ -439,7 +472,30 @@
                 <w:lang w:val="en-US"/>
                 <w14:ligatures w14:val="standardContextual"/>
               </w:rPr>
-              <w:t>{QSEducation}</w:t>
+              <w:t>{</w:t>
+            </w:r>
+            <w:proofErr w:type="spellStart"/>
+            <w:proofErr w:type="gramEnd"/>
+            <w:r>
+              <w:rPr>
+                <w:rFonts w:ascii="Bookman Old Style" w:hAnsi="Bookman Old Style"/>
+                <w:bCs/>
+                <w:kern w:val="2"/>
+                <w:lang w:val="en-US"/>
+                <w14:ligatures w14:val="standardContextual"/>
+              </w:rPr>
+              <w:t>QSEducation</w:t>
+            </w:r>
+            <w:proofErr w:type="spellEnd"/>
+            <w:r>
+              <w:rPr>
+                <w:rFonts w:ascii="Bookman Old Style" w:hAnsi="Bookman Old Style"/>
+                <w:bCs/>
+                <w:kern w:val="2"/>
+                <w:lang w:val="en-US"/>
+                <w14:ligatures w14:val="standardContextual"/>
+              </w:rPr>
+              <w:t>}</w:t>
             </w:r>
           </w:p>
         </w:tc>
@@ -468,7 +524,27 @@
                 <w:lang w:val="en-US"/>
                 <w14:ligatures w14:val="standardContextual"/>
               </w:rPr>
-              <w:t>{AppEducation}</w:t>
+              <w:t>{</w:t>
+            </w:r>
+            <w:proofErr w:type="spellStart"/>
+            <w:r>
+              <w:rPr>
+                <w:rFonts w:ascii="Bookman Old Style" w:hAnsi="Bookman Old Style"/>
+                <w:kern w:val="2"/>
+                <w:lang w:val="en-US"/>
+                <w14:ligatures w14:val="standardContextual"/>
+              </w:rPr>
+              <w:t>AppEducation</w:t>
+            </w:r>
+            <w:proofErr w:type="spellEnd"/>
+            <w:r>
+              <w:rPr>
+                <w:rFonts w:ascii="Bookman Old Style" w:hAnsi="Bookman Old Style"/>
+                <w:kern w:val="2"/>
+                <w:lang w:val="en-US"/>
+                <w14:ligatures w14:val="standardContextual"/>
+              </w:rPr>
+              <w:t>}</w:t>
             </w:r>
           </w:p>
         </w:tc>
@@ -498,7 +574,27 @@
                 <w:lang w:val="en-US"/>
                 <w14:ligatures w14:val="standardContextual"/>
               </w:rPr>
-              <w:t>{RmEducation}</w:t>
+              <w:t>{</w:t>
+            </w:r>
+            <w:proofErr w:type="spellStart"/>
+            <w:r>
+              <w:rPr>
+                <w:rFonts w:ascii="Bookman Old Style" w:hAnsi="Bookman Old Style"/>
+                <w:kern w:val="2"/>
+                <w:lang w:val="en-US"/>
+                <w14:ligatures w14:val="standardContextual"/>
+              </w:rPr>
+              <w:t>RmEducation</w:t>
+            </w:r>
+            <w:proofErr w:type="spellEnd"/>
+            <w:r>
+              <w:rPr>
+                <w:rFonts w:ascii="Bookman Old Style" w:hAnsi="Bookman Old Style"/>
+                <w:kern w:val="2"/>
+                <w:lang w:val="en-US"/>
+                <w14:ligatures w14:val="standardContextual"/>
+              </w:rPr>
+              <w:t>}</w:t>
             </w:r>
           </w:p>
         </w:tc>
@@ -553,7 +649,18 @@
                 <w:lang w:val="en-US"/>
                 <w14:ligatures w14:val="standardContextual"/>
               </w:rPr>
-              <w:t xml:space="preserve">Training: </w:t>
+              <w:t>Training</w:t>
+            </w:r>
+            <w:proofErr w:type="gramStart"/>
+            <w:r>
+              <w:rPr>
+                <w:rFonts w:ascii="Bookman Old Style" w:hAnsi="Bookman Old Style"/>
+                <w:b/>
+                <w:kern w:val="2"/>
+                <w:lang w:val="en-US"/>
+                <w14:ligatures w14:val="standardContextual"/>
+              </w:rPr>
+              <w:t xml:space="preserve">: </w:t>
             </w:r>
             <w:r>
               <w:rPr>
@@ -572,7 +679,30 @@
                 <w:lang w:val="en-US"/>
                 <w14:ligatures w14:val="standardContextual"/>
               </w:rPr>
-              <w:t>{QSTraining}</w:t>
+              <w:t>{</w:t>
+            </w:r>
+            <w:proofErr w:type="spellStart"/>
+            <w:proofErr w:type="gramEnd"/>
+            <w:r>
+              <w:rPr>
+                <w:rFonts w:ascii="Bookman Old Style" w:hAnsi="Bookman Old Style"/>
+                <w:bCs/>
+                <w:kern w:val="2"/>
+                <w:lang w:val="en-US"/>
+                <w14:ligatures w14:val="standardContextual"/>
+              </w:rPr>
+              <w:t>QSTraining</w:t>
+            </w:r>
+            <w:proofErr w:type="spellEnd"/>
+            <w:r>
+              <w:rPr>
+                <w:rFonts w:ascii="Bookman Old Style" w:hAnsi="Bookman Old Style"/>
+                <w:bCs/>
+                <w:kern w:val="2"/>
+                <w:lang w:val="en-US"/>
+                <w14:ligatures w14:val="standardContextual"/>
+              </w:rPr>
+              <w:t>}</w:t>
             </w:r>
           </w:p>
         </w:tc>
@@ -601,7 +731,27 @@
                 <w:lang w:val="en-US"/>
                 <w14:ligatures w14:val="standardContextual"/>
               </w:rPr>
-              <w:t>{AppTraining}</w:t>
+              <w:t>{</w:t>
+            </w:r>
+            <w:proofErr w:type="spellStart"/>
+            <w:r>
+              <w:rPr>
+                <w:rFonts w:ascii="Bookman Old Style" w:hAnsi="Bookman Old Style"/>
+                <w:kern w:val="2"/>
+                <w:lang w:val="en-US"/>
+                <w14:ligatures w14:val="standardContextual"/>
+              </w:rPr>
+              <w:t>AppTraining</w:t>
+            </w:r>
+            <w:proofErr w:type="spellEnd"/>
+            <w:r>
+              <w:rPr>
+                <w:rFonts w:ascii="Bookman Old Style" w:hAnsi="Bookman Old Style"/>
+                <w:kern w:val="2"/>
+                <w:lang w:val="en-US"/>
+                <w14:ligatures w14:val="standardContextual"/>
+              </w:rPr>
+              <w:t>}</w:t>
             </w:r>
           </w:p>
         </w:tc>
@@ -632,7 +782,27 @@
                 <w:lang w:val="en-US"/>
                 <w14:ligatures w14:val="standardContextual"/>
               </w:rPr>
-              <w:t>{RmExperience}</w:t>
+              <w:t>{</w:t>
+            </w:r>
+            <w:proofErr w:type="spellStart"/>
+            <w:r>
+              <w:rPr>
+                <w:rFonts w:ascii="Bookman Old Style" w:hAnsi="Bookman Old Style"/>
+                <w:kern w:val="2"/>
+                <w:lang w:val="en-US"/>
+                <w14:ligatures w14:val="standardContextual"/>
+              </w:rPr>
+              <w:t>RmExperience</w:t>
+            </w:r>
+            <w:proofErr w:type="spellEnd"/>
+            <w:r>
+              <w:rPr>
+                <w:rFonts w:ascii="Bookman Old Style" w:hAnsi="Bookman Old Style"/>
+                <w:kern w:val="2"/>
+                <w:lang w:val="en-US"/>
+                <w14:ligatures w14:val="standardContextual"/>
+              </w:rPr>
+              <w:t>}</w:t>
             </w:r>
           </w:p>
         </w:tc>
@@ -687,7 +857,18 @@
                 <w:lang w:val="en-US"/>
                 <w14:ligatures w14:val="standardContextual"/>
               </w:rPr>
-              <w:t xml:space="preserve">Experience: </w:t>
+              <w:t>Experience</w:t>
+            </w:r>
+            <w:proofErr w:type="gramStart"/>
+            <w:r>
+              <w:rPr>
+                <w:rFonts w:ascii="Bookman Old Style" w:hAnsi="Bookman Old Style"/>
+                <w:b/>
+                <w:kern w:val="2"/>
+                <w:lang w:val="en-US"/>
+                <w14:ligatures w14:val="standardContextual"/>
+              </w:rPr>
+              <w:t xml:space="preserve">: </w:t>
             </w:r>
             <w:r>
               <w:rPr>
@@ -706,7 +887,30 @@
                 <w:lang w:val="en-US"/>
                 <w14:ligatures w14:val="standardContextual"/>
               </w:rPr>
-              <w:t>{QSExperience}</w:t>
+              <w:t>{</w:t>
+            </w:r>
+            <w:proofErr w:type="spellStart"/>
+            <w:proofErr w:type="gramEnd"/>
+            <w:r>
+              <w:rPr>
+                <w:rFonts w:ascii="Bookman Old Style" w:hAnsi="Bookman Old Style"/>
+                <w:bCs/>
+                <w:kern w:val="2"/>
+                <w:lang w:val="en-US"/>
+                <w14:ligatures w14:val="standardContextual"/>
+              </w:rPr>
+              <w:t>QSExperience</w:t>
+            </w:r>
+            <w:proofErr w:type="spellEnd"/>
+            <w:r>
+              <w:rPr>
+                <w:rFonts w:ascii="Bookman Old Style" w:hAnsi="Bookman Old Style"/>
+                <w:bCs/>
+                <w:kern w:val="2"/>
+                <w:lang w:val="en-US"/>
+                <w14:ligatures w14:val="standardContextual"/>
+              </w:rPr>
+              <w:t>}</w:t>
             </w:r>
           </w:p>
         </w:tc>
@@ -735,7 +939,27 @@
                 <w:lang w:val="en-US"/>
                 <w14:ligatures w14:val="standardContextual"/>
               </w:rPr>
-              <w:t>{AppExperience}</w:t>
+              <w:t>{</w:t>
+            </w:r>
+            <w:proofErr w:type="spellStart"/>
+            <w:r>
+              <w:rPr>
+                <w:rFonts w:ascii="Bookman Old Style" w:hAnsi="Bookman Old Style"/>
+                <w:kern w:val="2"/>
+                <w:lang w:val="en-US"/>
+                <w14:ligatures w14:val="standardContextual"/>
+              </w:rPr>
+              <w:t>AppExperience</w:t>
+            </w:r>
+            <w:proofErr w:type="spellEnd"/>
+            <w:r>
+              <w:rPr>
+                <w:rFonts w:ascii="Bookman Old Style" w:hAnsi="Bookman Old Style"/>
+                <w:kern w:val="2"/>
+                <w:lang w:val="en-US"/>
+                <w14:ligatures w14:val="standardContextual"/>
+              </w:rPr>
+              <w:t>}</w:t>
             </w:r>
           </w:p>
         </w:tc>
@@ -765,7 +989,27 @@
                 <w:lang w:val="en-US"/>
                 <w14:ligatures w14:val="standardContextual"/>
               </w:rPr>
-              <w:t>{RmTraining}</w:t>
+              <w:t>{</w:t>
+            </w:r>
+            <w:proofErr w:type="spellStart"/>
+            <w:r>
+              <w:rPr>
+                <w:rFonts w:ascii="Bookman Old Style" w:hAnsi="Bookman Old Style"/>
+                <w:kern w:val="2"/>
+                <w:lang w:val="en-US"/>
+                <w14:ligatures w14:val="standardContextual"/>
+              </w:rPr>
+              <w:t>RmTraining</w:t>
+            </w:r>
+            <w:proofErr w:type="spellEnd"/>
+            <w:r>
+              <w:rPr>
+                <w:rFonts w:ascii="Bookman Old Style" w:hAnsi="Bookman Old Style"/>
+                <w:kern w:val="2"/>
+                <w:lang w:val="en-US"/>
+                <w14:ligatures w14:val="standardContextual"/>
+              </w:rPr>
+              <w:t>}</w:t>
             </w:r>
           </w:p>
         </w:tc>
@@ -820,7 +1064,18 @@
                 <w:lang w:val="en-US"/>
                 <w14:ligatures w14:val="standardContextual"/>
               </w:rPr>
-              <w:t>Eligibility:</w:t>
+              <w:t>Eligibility</w:t>
+            </w:r>
+            <w:proofErr w:type="gramStart"/>
+            <w:r>
+              <w:rPr>
+                <w:rFonts w:ascii="Bookman Old Style" w:hAnsi="Bookman Old Style"/>
+                <w:b/>
+                <w:kern w:val="2"/>
+                <w:lang w:val="en-US"/>
+                <w14:ligatures w14:val="standardContextual"/>
+              </w:rPr>
+              <w:t>:</w:t>
             </w:r>
             <w:r>
               <w:rPr>
@@ -839,7 +1094,30 @@
                 <w:lang w:val="en-US"/>
                 <w14:ligatures w14:val="standardContextual"/>
               </w:rPr>
-              <w:t>{QSEligibility}</w:t>
+              <w:t>{</w:t>
+            </w:r>
+            <w:proofErr w:type="spellStart"/>
+            <w:proofErr w:type="gramEnd"/>
+            <w:r>
+              <w:rPr>
+                <w:rFonts w:ascii="Bookman Old Style" w:hAnsi="Bookman Old Style"/>
+                <w:bCs/>
+                <w:kern w:val="2"/>
+                <w:lang w:val="en-US"/>
+                <w14:ligatures w14:val="standardContextual"/>
+              </w:rPr>
+              <w:t>QSEligibility</w:t>
+            </w:r>
+            <w:proofErr w:type="spellEnd"/>
+            <w:r>
+              <w:rPr>
+                <w:rFonts w:ascii="Bookman Old Style" w:hAnsi="Bookman Old Style"/>
+                <w:bCs/>
+                <w:kern w:val="2"/>
+                <w:lang w:val="en-US"/>
+                <w14:ligatures w14:val="standardContextual"/>
+              </w:rPr>
+              <w:t>}</w:t>
             </w:r>
           </w:p>
         </w:tc>
@@ -868,7 +1146,27 @@
                 <w:lang w:val="en-US"/>
                 <w14:ligatures w14:val="standardContextual"/>
               </w:rPr>
-              <w:t>{AppEligibility}</w:t>
+              <w:t>{</w:t>
+            </w:r>
+            <w:proofErr w:type="spellStart"/>
+            <w:r>
+              <w:rPr>
+                <w:rFonts w:ascii="Bookman Old Style" w:hAnsi="Bookman Old Style"/>
+                <w:kern w:val="2"/>
+                <w:lang w:val="en-US"/>
+                <w14:ligatures w14:val="standardContextual"/>
+              </w:rPr>
+              <w:t>AppEligibility</w:t>
+            </w:r>
+            <w:proofErr w:type="spellEnd"/>
+            <w:r>
+              <w:rPr>
+                <w:rFonts w:ascii="Bookman Old Style" w:hAnsi="Bookman Old Style"/>
+                <w:kern w:val="2"/>
+                <w:lang w:val="en-US"/>
+                <w14:ligatures w14:val="standardContextual"/>
+              </w:rPr>
+              <w:t>}</w:t>
             </w:r>
           </w:p>
         </w:tc>
@@ -898,7 +1196,27 @@
                 <w:lang w:val="en-US"/>
                 <w14:ligatures w14:val="standardContextual"/>
               </w:rPr>
-              <w:t>{RmEligibility}</w:t>
+              <w:t>{</w:t>
+            </w:r>
+            <w:proofErr w:type="spellStart"/>
+            <w:r>
+              <w:rPr>
+                <w:rFonts w:ascii="Bookman Old Style" w:hAnsi="Bookman Old Style"/>
+                <w:kern w:val="2"/>
+                <w:lang w:val="en-US"/>
+                <w14:ligatures w14:val="standardContextual"/>
+              </w:rPr>
+              <w:t>RmEligibility</w:t>
+            </w:r>
+            <w:proofErr w:type="spellEnd"/>
+            <w:r>
+              <w:rPr>
+                <w:rFonts w:ascii="Bookman Old Style" w:hAnsi="Bookman Old Style"/>
+                <w:kern w:val="2"/>
+                <w:lang w:val="en-US"/>
+                <w14:ligatures w14:val="standardContextual"/>
+              </w:rPr>
+              <w:t>}</w:t>
             </w:r>
           </w:p>
         </w:tc>
@@ -1064,7 +1382,29 @@
           <w:sz w:val="21"/>
           <w:szCs w:val="21"/>
         </w:rPr>
-        <w:t>{ApplicationCode}</w:t>
+        <w:t>{</w:t>
+      </w:r>
+      <w:proofErr w:type="spellStart"/>
+      <w:r>
+        <w:rPr>
+          <w:rFonts w:ascii="Bookman Old Style" w:hAnsi="Bookman Old Style"/>
+          <w:b/>
+          <w:bCs/>
+          <w:sz w:val="21"/>
+          <w:szCs w:val="21"/>
+        </w:rPr>
+        <w:t>ApplicationCode</w:t>
+      </w:r>
+      <w:proofErr w:type="spellEnd"/>
+      <w:r>
+        <w:rPr>
+          <w:rFonts w:ascii="Bookman Old Style" w:hAnsi="Bookman Old Style"/>
+          <w:b/>
+          <w:bCs/>
+          <w:sz w:val="21"/>
+          <w:szCs w:val="21"/>
+        </w:rPr>
+        <w:t>}</w:t>
       </w:r>
       <w:r>
         <w:rPr>
@@ -1798,13 +2138,13 @@
       <mc:AlternateContent>
         <mc:Choice Requires="wps">
           <w:drawing>
-            <wp:anchor distT="0" distB="0" distL="114300" distR="114300" simplePos="0" relativeHeight="251665408" behindDoc="0" locked="0" layoutInCell="1" allowOverlap="1" wp14:anchorId="098F1ADA" wp14:editId="448A632D">
+            <wp:anchor distT="0" distB="0" distL="114300" distR="114300" simplePos="0" relativeHeight="251665408" behindDoc="0" locked="0" layoutInCell="1" allowOverlap="1" wp14:anchorId="098F1ADA" wp14:editId="098D0DC2">
               <wp:simplePos x="0" y="0"/>
               <wp:positionH relativeFrom="column">
                 <wp:posOffset>3139440</wp:posOffset>
               </wp:positionH>
               <wp:positionV relativeFrom="paragraph">
-                <wp:posOffset>188595</wp:posOffset>
+                <wp:posOffset>234315</wp:posOffset>
               </wp:positionV>
               <wp:extent cx="2113280" cy="299720"/>
               <wp:effectExtent l="0" t="0" r="1270" b="5080"/>
@@ -2164,7 +2504,7 @@
         </mc:Choice>
         <mc:Fallback>
           <w:pict>
-            <v:shape w14:anchorId="098F1ADA" id="Text Box 3" o:spid="_x0000_s1027" type="#_x0000_t202" style="position:absolute;margin-left:247.2pt;margin-top:14.85pt;width:166.4pt;height:23.6pt;z-index:251665408;visibility:visible;mso-wrap-style:square;mso-width-percent:0;mso-height-percent:0;mso-wrap-distance-left:9pt;mso-wrap-distance-top:0;mso-wrap-distance-right:9pt;mso-wrap-distance-bottom:0;mso-position-horizontal:absolute;mso-position-horizontal-relative:text;mso-position-vertical:absolute;mso-position-vertical-relative:text;mso-width-percent:0;mso-height-percent:0;mso-width-relative:page;mso-height-relative:page;v-text-anchor:top" o:gfxdata="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" stroked="f">
+            <v:shape w14:anchorId="098F1ADA" id="Text Box 3" o:spid="_x0000_s1027" type="#_x0000_t202" style="position:absolute;margin-left:247.2pt;margin-top:18.45pt;width:166.4pt;height:23.6pt;z-index:251665408;visibility:visible;mso-wrap-style:square;mso-width-percent:0;mso-height-percent:0;mso-wrap-distance-left:9pt;mso-wrap-distance-top:0;mso-wrap-distance-right:9pt;mso-wrap-distance-bottom:0;mso-position-horizontal:absolute;mso-position-horizontal-relative:text;mso-position-vertical:absolute;mso-position-vertical-relative:text;mso-width-percent:0;mso-height-percent:0;mso-width-relative:page;mso-height-relative:page;v-text-anchor:top" o:gfxdata="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" stroked="f">
               <v:textbox inset="1.44pt,0,0,0">
                 <w:txbxContent>
                   <w:tbl>

</xml_diff>